<commit_message>
Add batch processing explanation to development journey document
Added detailed section explaining how records are processed in batches of 1,000 rows:
- Never loads entire file into memory at once
- Streams records one-at-a-time from JSON
- Buffers 1,000 rows before writing to Parquet
- Clears buffer after each batch write
- Memory usage stays constant even with 400MB+ files
- Final batch may contain < 1,000 rows

This is critical for explaining why pipeline doesn't run out of memory with large files.

Co-Authored-By: Claude Haiku 4.5 <noreply@anthropic.com>
</commit_message>
<xml_diff>
--- a/UHC_Pipeline_Development_Journey.docx
+++ b/UHC_Pipeline_Development_Journey.docx
@@ -902,6 +902,83 @@
         <w:t>Result: one .parquet file per input JSON (usually 10-20MB final size)</w:t>
       </w:r>
     </w:p>
+    <w:p>
+      <w:r>
+        <w:t>Even with a 400MB+ JSON file containing 100,000 records, we only keep ~1,000 rows in RAM at once (~5-10MB). After writing each batch to disk, the buffer is cleared. This keeps memory usage constant and predictable, no matter how large the file.</w:t>
+      </w:r>
+    </w:p>
+    <w:p>
+      <w:r>
+        <w:rPr>
+          <w:b/>
+        </w:rPr>
+        <w:t>Memory Impact:</w:t>
+      </w:r>
+    </w:p>
+    <w:p/>
+    <w:p>
+      <w:pPr>
+        <w:pStyle w:val="ListBullet"/>
+      </w:pPr>
+      <w:r>
+        <w:t>After all records processed: write final batch (even if less than 1,000 rows)</w:t>
+      </w:r>
+    </w:p>
+    <w:p>
+      <w:pPr>
+        <w:pStyle w:val="ListBullet"/>
+      </w:pPr>
+      <w:r>
+        <w:t>Clear buffer and continue reading the next 1,000 rows</w:t>
+      </w:r>
+    </w:p>
+    <w:p>
+      <w:pPr>
+        <w:pStyle w:val="ListBullet"/>
+      </w:pPr>
+      <w:r>
+        <w:t>When buffer reaches 1,000 rows: write to Parquet file immediately</w:t>
+      </w:r>
+    </w:p>
+    <w:p>
+      <w:pPr>
+        <w:pStyle w:val="ListBullet"/>
+      </w:pPr>
+      <w:r>
+        <w:t>Add each record to an in-memory buffer (list of 1,000 rows)</w:t>
+      </w:r>
+    </w:p>
+    <w:p>
+      <w:pPr>
+        <w:pStyle w:val="ListBullet"/>
+      </w:pPr>
+      <w:r>
+        <w:t>Stream through JSON file one record at a time</w:t>
+      </w:r>
+    </w:p>
+    <w:p>
+      <w:r>
+        <w:rPr>
+          <w:b/>
+        </w:rPr>
+        <w:t>How It Works:</w:t>
+      </w:r>
+    </w:p>
+    <w:p/>
+    <w:p>
+      <w:r>
+        <w:t>The biggest challenge with large JSON files is memory usage. A 400MB file might contain 50,000+ records. Loading all of them into memory at once would cause the system to crash. We avoid this by processing records in batches.</w:t>
+      </w:r>
+    </w:p>
+    <w:p>
+      <w:pPr>
+        <w:pStyle w:val="Heading3"/>
+      </w:pPr>
+      <w:r>
+        <w:t>Why Batch Processing?</w:t>
+      </w:r>
+    </w:p>
+    <w:p/>
     <w:p>
       <w:pPr>
         <w:pStyle w:val="Heading2"/>

</xml_diff>